<commit_message>
docs: form su dung tai cho khong can dang nhap (SOP, huong dan, quy trinh v2.0)
</commit_message>
<xml_diff>
--- a/QUY_TRINH_SU_DUNG_THIET_BI.docx
+++ b/QUY_TRINH_SU_DUNG_THIET_BI.docx
@@ -3203,7 +3203,7 @@
                 <w:sz w:val="20"/>
                 <w:szCs w:val="20"/>
               </w:rPr>
-              <w:t xml:space="preserve">Đăng nhập email trường (@hus.edu.vn) nếu được hỏi; điền họ tên, đơn vị, mục đích, số giờ sử dụng (0,5 – 24 giờ)</w:t>
+              <w:t>Điền họ tên, email, đơn vị, mục đích, số giờ sử dụng (0,5 – 24 giờ); không cần đăng nhập</w:t>
             </w:r>
           </w:p>
         </w:tc>
@@ -6888,7 +6888,7 @@
                 <w:sz w:val="22"/>
                 <w:szCs w:val="22"/>
               </w:rPr>
-              <w:t xml:space="preserve">1. Quét QR → "Sử dụng tại chỗ" (email trường)</w:t>
+              <w:t>1. Quét QR → "Sử dụng tại chỗ"</w:t>
             </w:r>
           </w:p>
           <w:p>

</xml_diff>